<commit_message>
Update report and main
</commit_message>
<xml_diff>
--- a/ai_13/andrii_shykoriak/epic_4/epic_4_report_andrii_shykoriak.docx
+++ b/ai_13/andrii_shykoriak/epic_4/epic_4_report_andrii_shykoriak.docx
@@ -4736,18 +4736,17 @@
       <w:r>
         <w:rPr>
           <w:i/>
-          <w:noProof/>
           <w:color w:val="000000"/>
           <w:sz w:val="18"/>
           <w:szCs w:val="18"/>
-          <w:lang w:val="uk-UA" w:eastAsia="uk-UA"/>
+          <w:lang w:val="ru-RU"/>
         </w:rPr>
         <w:lastRenderedPageBreak/>
         <w:drawing>
-          <wp:inline distT="0" distB="0" distL="0" distR="0" wp14:anchorId="738ADC1F" wp14:editId="31190CD4">
-            <wp:extent cx="3360711" cy="5768840"/>
-            <wp:effectExtent l="0" t="0" r="0" b="3810"/>
-            <wp:docPr id="16" name="Рисунок 16"/>
+          <wp:inline distT="0" distB="0" distL="0" distR="0" wp14:anchorId="324698BB" wp14:editId="6FC77354">
+            <wp:extent cx="3787468" cy="5989839"/>
+            <wp:effectExtent l="0" t="0" r="3810" b="0"/>
+            <wp:docPr id="5" name="Рисунок 5"/>
             <wp:cNvGraphicFramePr>
               <a:graphicFrameLocks xmlns:a="http://schemas.openxmlformats.org/drawingml/2006/main" noChangeAspect="1"/>
             </wp:cNvGraphicFramePr>
@@ -4767,7 +4766,7 @@
                   <pic:spPr>
                     <a:xfrm>
                       <a:off x="0" y="0"/>
-                      <a:ext cx="3360711" cy="5768840"/>
+                      <a:ext cx="3787468" cy="5989839"/>
                     </a:xfrm>
                     <a:prstGeom prst="rect">
                       <a:avLst/>
@@ -5114,18 +5113,17 @@
       <w:r>
         <w:rPr>
           <w:i/>
-          <w:noProof/>
           <w:color w:val="000000"/>
           <w:sz w:val="18"/>
           <w:szCs w:val="18"/>
-          <w:lang w:val="uk-UA" w:eastAsia="uk-UA"/>
+          <w:lang w:val="ru-RU"/>
         </w:rPr>
         <w:lastRenderedPageBreak/>
         <w:drawing>
-          <wp:inline distT="0" distB="0" distL="0" distR="0" wp14:anchorId="6F5CB8A3" wp14:editId="54EE4C45">
-            <wp:extent cx="6120765" cy="2345055"/>
-            <wp:effectExtent l="0" t="0" r="0" b="0"/>
-            <wp:docPr id="21" name="Рисунок 21"/>
+          <wp:inline distT="0" distB="0" distL="0" distR="0" wp14:anchorId="70D226CF" wp14:editId="5442365B">
+            <wp:extent cx="6120765" cy="2454275"/>
+            <wp:effectExtent l="0" t="0" r="0" b="3175"/>
+            <wp:docPr id="8" name="Рисунок 8"/>
             <wp:cNvGraphicFramePr>
               <a:graphicFrameLocks xmlns:a="http://schemas.openxmlformats.org/drawingml/2006/main" noChangeAspect="1"/>
             </wp:cNvGraphicFramePr>
@@ -5145,7 +5143,7 @@
                   <pic:spPr>
                     <a:xfrm>
                       <a:off x="0" y="0"/>
-                      <a:ext cx="6120765" cy="2345055"/>
+                      <a:ext cx="6120765" cy="2454275"/>
                     </a:xfrm>
                     <a:prstGeom prst="rect">
                       <a:avLst/>
@@ -5157,6 +5155,8 @@
           </wp:inline>
         </w:drawing>
       </w:r>
+      <w:bookmarkStart w:id="1" w:name="_GoBack"/>
+      <w:bookmarkEnd w:id="1"/>
     </w:p>
     <w:p>
       <w:pPr>
@@ -7226,6 +7226,7 @@
           <w:sz w:val="21"/>
           <w:szCs w:val="21"/>
         </w:rPr>
+        <w:lastRenderedPageBreak/>
         <w:t xml:space="preserve">    </w:t>
       </w:r>
       <w:r>
@@ -7319,7 +7320,6 @@
           <w:sz w:val="21"/>
           <w:szCs w:val="21"/>
         </w:rPr>
-        <w:lastRenderedPageBreak/>
         <w:t xml:space="preserve">    </w:t>
       </w:r>
       <w:r>
@@ -27151,7 +27151,7 @@
         <w:spacing w:line="285" w:lineRule="atLeast"/>
         <w:rPr>
           <w:rFonts w:ascii="Consolas" w:hAnsi="Consolas"/>
-          <w:color w:val="BBBEBF"/>
+          <w:color w:val="C9D1D9"/>
           <w:sz w:val="21"/>
           <w:szCs w:val="21"/>
           <w:lang w:val="uk-UA" w:eastAsia="uk-UA"/>
@@ -27208,6 +27208,124 @@
           <w:szCs w:val="21"/>
           <w:lang w:val="uk-UA" w:eastAsia="uk-UA"/>
         </w:rPr>
+        <w:tab/>
+      </w:r>
+      <w:r>
+        <w:rPr>
+          <w:rFonts w:ascii="Consolas" w:hAnsi="Consolas"/>
+          <w:color w:val="C9D1D9"/>
+          <w:sz w:val="21"/>
+          <w:szCs w:val="21"/>
+          <w:lang w:val="en-US" w:eastAsia="uk-UA"/>
+        </w:rPr>
+        <w:t xml:space="preserve">  </w:t>
+      </w:r>
+      <w:proofErr w:type="gramStart"/>
+      <w:r>
+        <w:rPr>
+          <w:rFonts w:ascii="Consolas" w:hAnsi="Consolas"/>
+          <w:color w:val="C9D1D9"/>
+          <w:sz w:val="21"/>
+          <w:szCs w:val="21"/>
+          <w:lang w:val="en-US" w:eastAsia="uk-UA"/>
+        </w:rPr>
+        <w:t>i</w:t>
+      </w:r>
+      <w:r>
+        <w:rPr>
+          <w:rFonts w:ascii="Consolas" w:hAnsi="Consolas"/>
+          <w:color w:val="C9D1D9"/>
+          <w:sz w:val="21"/>
+          <w:szCs w:val="21"/>
+          <w:lang w:val="uk-UA" w:eastAsia="uk-UA"/>
+        </w:rPr>
+        <w:t>mage[</w:t>
+      </w:r>
+      <w:proofErr w:type="gramEnd"/>
+      <w:r>
+        <w:rPr>
+          <w:rFonts w:ascii="Consolas" w:hAnsi="Consolas"/>
+          <w:color w:val="C9D1D9"/>
+          <w:sz w:val="21"/>
+          <w:szCs w:val="21"/>
+          <w:lang w:val="uk-UA" w:eastAsia="uk-UA"/>
+        </w:rPr>
+        <w:t xml:space="preserve">i] </w:t>
+      </w:r>
+      <w:r>
+        <w:rPr>
+          <w:rFonts w:ascii="Consolas" w:hAnsi="Consolas"/>
+          <w:color w:val="D4D4D4"/>
+          <w:sz w:val="21"/>
+          <w:szCs w:val="21"/>
+          <w:lang w:val="uk-UA" w:eastAsia="uk-UA"/>
+        </w:rPr>
+        <w:t>=</w:t>
+      </w:r>
+      <w:r>
+        <w:rPr>
+          <w:rFonts w:ascii="Consolas" w:hAnsi="Consolas"/>
+          <w:color w:val="C9D1D9"/>
+          <w:sz w:val="21"/>
+          <w:szCs w:val="21"/>
+          <w:lang w:val="uk-UA" w:eastAsia="uk-UA"/>
+        </w:rPr>
+        <w:t xml:space="preserve"> </w:t>
+      </w:r>
+      <w:r>
+        <w:rPr>
+          <w:rFonts w:ascii="Consolas" w:hAnsi="Consolas"/>
+          <w:color w:val="569CD6"/>
+          <w:sz w:val="21"/>
+          <w:szCs w:val="21"/>
+          <w:lang w:val="uk-UA" w:eastAsia="uk-UA"/>
+        </w:rPr>
+        <w:t>nullptr</w:t>
+      </w:r>
+      <w:r>
+        <w:rPr>
+          <w:rFonts w:ascii="Consolas" w:hAnsi="Consolas"/>
+          <w:color w:val="C9D1D9"/>
+          <w:sz w:val="21"/>
+          <w:szCs w:val="21"/>
+          <w:lang w:val="uk-UA" w:eastAsia="uk-UA"/>
+        </w:rPr>
+        <w:t>;</w:t>
+      </w:r>
+    </w:p>
+    <w:p>
+      <w:pPr>
+        <w:shd w:val="clear" w:color="auto" w:fill="121314"/>
+        <w:spacing w:line="285" w:lineRule="atLeast"/>
+        <w:rPr>
+          <w:rFonts w:ascii="Consolas" w:hAnsi="Consolas"/>
+          <w:color w:val="BBBEBF"/>
+          <w:sz w:val="21"/>
+          <w:szCs w:val="21"/>
+          <w:lang w:val="en-US" w:eastAsia="uk-UA"/>
+        </w:rPr>
+      </w:pPr>
+    </w:p>
+    <w:p>
+      <w:pPr>
+        <w:shd w:val="clear" w:color="auto" w:fill="121314"/>
+        <w:spacing w:line="285" w:lineRule="atLeast"/>
+        <w:rPr>
+          <w:rFonts w:ascii="Consolas" w:hAnsi="Consolas"/>
+          <w:color w:val="BBBEBF"/>
+          <w:sz w:val="21"/>
+          <w:szCs w:val="21"/>
+          <w:lang w:val="uk-UA" w:eastAsia="uk-UA"/>
+        </w:rPr>
+      </w:pPr>
+      <w:r>
+        <w:rPr>
+          <w:rFonts w:ascii="Consolas" w:hAnsi="Consolas"/>
+          <w:color w:val="C9D1D9"/>
+          <w:sz w:val="21"/>
+          <w:szCs w:val="21"/>
+          <w:lang w:val="uk-UA" w:eastAsia="uk-UA"/>
+        </w:rPr>
         <w:t>    }</w:t>
       </w:r>
     </w:p>
@@ -27479,6 +27597,7 @@
           <w:szCs w:val="21"/>
           <w:lang w:val="uk-UA" w:eastAsia="uk-UA"/>
         </w:rPr>
+        <w:lastRenderedPageBreak/>
         <w:t>void</w:t>
       </w:r>
       <w:r>
@@ -27885,7 +28004,6 @@
           <w:szCs w:val="21"/>
           <w:lang w:val="uk-UA" w:eastAsia="uk-UA"/>
         </w:rPr>
-        <w:lastRenderedPageBreak/>
         <w:t xml:space="preserve">        </w:t>
       </w:r>
       <w:r>
@@ -32595,349 +32713,6 @@
           <w:lang w:val="uk-UA" w:eastAsia="uk-UA"/>
         </w:rPr>
       </w:pPr>
-    </w:p>
-    <w:p>
-      <w:pPr>
-        <w:shd w:val="clear" w:color="auto" w:fill="121314"/>
-        <w:spacing w:line="285" w:lineRule="atLeast"/>
-        <w:rPr>
-          <w:rFonts w:ascii="Consolas" w:hAnsi="Consolas"/>
-          <w:color w:val="BBBEBF"/>
-          <w:sz w:val="21"/>
-          <w:szCs w:val="21"/>
-          <w:lang w:val="uk-UA" w:eastAsia="uk-UA"/>
-        </w:rPr>
-      </w:pPr>
-      <w:r>
-        <w:rPr>
-          <w:rFonts w:ascii="Consolas" w:hAnsi="Consolas"/>
-          <w:color w:val="BBBEBF"/>
-          <w:sz w:val="21"/>
-          <w:szCs w:val="21"/>
-          <w:lang w:val="uk-UA" w:eastAsia="uk-UA"/>
-        </w:rPr>
-        <w:t xml:space="preserve">    </w:t>
-      </w:r>
-      <w:r>
-        <w:rPr>
-          <w:rFonts w:ascii="Consolas" w:hAnsi="Consolas"/>
-          <w:color w:val="C9D1D9"/>
-          <w:sz w:val="21"/>
-          <w:szCs w:val="21"/>
-          <w:lang w:val="uk-UA" w:eastAsia="uk-UA"/>
-        </w:rPr>
-        <w:t>cout</w:t>
-      </w:r>
-      <w:r>
-        <w:rPr>
-          <w:rFonts w:ascii="Consolas" w:hAnsi="Consolas"/>
-          <w:color w:val="BBBEBF"/>
-          <w:sz w:val="21"/>
-          <w:szCs w:val="21"/>
-          <w:lang w:val="uk-UA" w:eastAsia="uk-UA"/>
-        </w:rPr>
-        <w:t xml:space="preserve"> </w:t>
-      </w:r>
-      <w:r>
-        <w:rPr>
-          <w:rFonts w:ascii="Consolas" w:hAnsi="Consolas"/>
-          <w:color w:val="D2A8FF"/>
-          <w:sz w:val="21"/>
-          <w:szCs w:val="21"/>
-          <w:lang w:val="uk-UA" w:eastAsia="uk-UA"/>
-        </w:rPr>
-        <w:t>&lt;&lt;</w:t>
-      </w:r>
-      <w:r>
-        <w:rPr>
-          <w:rFonts w:ascii="Consolas" w:hAnsi="Consolas"/>
-          <w:color w:val="BBBEBF"/>
-          <w:sz w:val="21"/>
-          <w:szCs w:val="21"/>
-          <w:lang w:val="uk-UA" w:eastAsia="uk-UA"/>
-        </w:rPr>
-        <w:t xml:space="preserve"> </w:t>
-      </w:r>
-      <w:r>
-        <w:rPr>
-          <w:rFonts w:ascii="Consolas" w:hAnsi="Consolas"/>
-          <w:color w:val="A5D6FF"/>
-          <w:sz w:val="21"/>
-          <w:szCs w:val="21"/>
-          <w:lang w:val="uk-UA" w:eastAsia="uk-UA"/>
-        </w:rPr>
-        <w:t>"Середня яскравість: "</w:t>
-      </w:r>
-      <w:r>
-        <w:rPr>
-          <w:rFonts w:ascii="Consolas" w:hAnsi="Consolas"/>
-          <w:color w:val="BBBEBF"/>
-          <w:sz w:val="21"/>
-          <w:szCs w:val="21"/>
-          <w:lang w:val="uk-UA" w:eastAsia="uk-UA"/>
-        </w:rPr>
-        <w:t xml:space="preserve"> </w:t>
-      </w:r>
-      <w:r>
-        <w:rPr>
-          <w:rFonts w:ascii="Consolas" w:hAnsi="Consolas"/>
-          <w:color w:val="D2A8FF"/>
-          <w:sz w:val="21"/>
-          <w:szCs w:val="21"/>
-          <w:lang w:val="uk-UA" w:eastAsia="uk-UA"/>
-        </w:rPr>
-        <w:t>&lt;&lt;</w:t>
-      </w:r>
-      <w:r>
-        <w:rPr>
-          <w:rFonts w:ascii="Consolas" w:hAnsi="Consolas"/>
-          <w:color w:val="BBBEBF"/>
-          <w:sz w:val="21"/>
-          <w:szCs w:val="21"/>
-          <w:lang w:val="uk-UA" w:eastAsia="uk-UA"/>
-        </w:rPr>
-        <w:t xml:space="preserve"> </w:t>
-      </w:r>
-      <w:r>
-        <w:rPr>
-          <w:rFonts w:ascii="Consolas" w:hAnsi="Consolas"/>
-          <w:color w:val="D2A8FF"/>
-          <w:sz w:val="21"/>
-          <w:szCs w:val="21"/>
-          <w:lang w:val="uk-UA" w:eastAsia="uk-UA"/>
-        </w:rPr>
-        <w:t>fixed</w:t>
-      </w:r>
-      <w:r>
-        <w:rPr>
-          <w:rFonts w:ascii="Consolas" w:hAnsi="Consolas"/>
-          <w:color w:val="BBBEBF"/>
-          <w:sz w:val="21"/>
-          <w:szCs w:val="21"/>
-          <w:lang w:val="uk-UA" w:eastAsia="uk-UA"/>
-        </w:rPr>
-        <w:t xml:space="preserve"> </w:t>
-      </w:r>
-      <w:r>
-        <w:rPr>
-          <w:rFonts w:ascii="Consolas" w:hAnsi="Consolas"/>
-          <w:color w:val="D2A8FF"/>
-          <w:sz w:val="21"/>
-          <w:szCs w:val="21"/>
-          <w:lang w:val="uk-UA" w:eastAsia="uk-UA"/>
-        </w:rPr>
-        <w:t>&lt;&lt;</w:t>
-      </w:r>
-      <w:r>
-        <w:rPr>
-          <w:rFonts w:ascii="Consolas" w:hAnsi="Consolas"/>
-          <w:color w:val="BBBEBF"/>
-          <w:sz w:val="21"/>
-          <w:szCs w:val="21"/>
-          <w:lang w:val="uk-UA" w:eastAsia="uk-UA"/>
-        </w:rPr>
-        <w:t xml:space="preserve"> </w:t>
-      </w:r>
-      <w:r>
-        <w:rPr>
-          <w:rFonts w:ascii="Consolas" w:hAnsi="Consolas"/>
-          <w:color w:val="D2A8FF"/>
-          <w:sz w:val="21"/>
-          <w:szCs w:val="21"/>
-          <w:lang w:val="uk-UA" w:eastAsia="uk-UA"/>
-        </w:rPr>
-        <w:t>setprecision</w:t>
-      </w:r>
-      <w:r>
-        <w:rPr>
-          <w:rFonts w:ascii="Consolas" w:hAnsi="Consolas"/>
-          <w:color w:val="BBBEBF"/>
-          <w:sz w:val="21"/>
-          <w:szCs w:val="21"/>
-          <w:lang w:val="uk-UA" w:eastAsia="uk-UA"/>
-        </w:rPr>
-        <w:t>(</w:t>
-      </w:r>
-      <w:r>
-        <w:rPr>
-          <w:rFonts w:ascii="Consolas" w:hAnsi="Consolas"/>
-          <w:color w:val="B5CEA8"/>
-          <w:sz w:val="21"/>
-          <w:szCs w:val="21"/>
-          <w:lang w:val="uk-UA" w:eastAsia="uk-UA"/>
-        </w:rPr>
-        <w:t>2</w:t>
-      </w:r>
-      <w:r>
-        <w:rPr>
-          <w:rFonts w:ascii="Consolas" w:hAnsi="Consolas"/>
-          <w:color w:val="BBBEBF"/>
-          <w:sz w:val="21"/>
-          <w:szCs w:val="21"/>
-          <w:lang w:val="uk-UA" w:eastAsia="uk-UA"/>
-        </w:rPr>
-        <w:t xml:space="preserve">) </w:t>
-      </w:r>
-      <w:r>
-        <w:rPr>
-          <w:rFonts w:ascii="Consolas" w:hAnsi="Consolas"/>
-          <w:color w:val="D2A8FF"/>
-          <w:sz w:val="21"/>
-          <w:szCs w:val="21"/>
-          <w:lang w:val="uk-UA" w:eastAsia="uk-UA"/>
-        </w:rPr>
-        <w:t>&lt;&lt;</w:t>
-      </w:r>
-      <w:r>
-        <w:rPr>
-          <w:rFonts w:ascii="Consolas" w:hAnsi="Consolas"/>
-          <w:color w:val="BBBEBF"/>
-          <w:sz w:val="21"/>
-          <w:szCs w:val="21"/>
-          <w:lang w:val="uk-UA" w:eastAsia="uk-UA"/>
-        </w:rPr>
-        <w:t xml:space="preserve"> (</w:t>
-      </w:r>
-      <w:r>
-        <w:rPr>
-          <w:rFonts w:ascii="Consolas" w:hAnsi="Consolas"/>
-          <w:color w:val="C9D1D9"/>
-          <w:sz w:val="21"/>
-          <w:szCs w:val="21"/>
-          <w:lang w:val="uk-UA" w:eastAsia="uk-UA"/>
-        </w:rPr>
-        <w:t>average_brightness</w:t>
-      </w:r>
-      <w:r>
-        <w:rPr>
-          <w:rFonts w:ascii="Consolas" w:hAnsi="Consolas"/>
-          <w:color w:val="BBBEBF"/>
-          <w:sz w:val="21"/>
-          <w:szCs w:val="21"/>
-          <w:lang w:val="uk-UA" w:eastAsia="uk-UA"/>
-        </w:rPr>
-        <w:t xml:space="preserve"> </w:t>
-      </w:r>
-      <w:r>
-        <w:rPr>
-          <w:rFonts w:ascii="Consolas" w:hAnsi="Consolas"/>
-          <w:color w:val="D4D4D4"/>
-          <w:sz w:val="21"/>
-          <w:szCs w:val="21"/>
-          <w:lang w:val="uk-UA" w:eastAsia="uk-UA"/>
-        </w:rPr>
-        <w:t>/</w:t>
-      </w:r>
-      <w:r>
-        <w:rPr>
-          <w:rFonts w:ascii="Consolas" w:hAnsi="Consolas"/>
-          <w:color w:val="BBBEBF"/>
-          <w:sz w:val="21"/>
-          <w:szCs w:val="21"/>
-          <w:lang w:val="uk-UA" w:eastAsia="uk-UA"/>
-        </w:rPr>
-        <w:t xml:space="preserve"> (</w:t>
-      </w:r>
-      <w:r>
-        <w:rPr>
-          <w:rFonts w:ascii="Consolas" w:hAnsi="Consolas"/>
-          <w:color w:val="FFA657"/>
-          <w:sz w:val="21"/>
-          <w:szCs w:val="21"/>
-          <w:lang w:val="uk-UA" w:eastAsia="uk-UA"/>
-        </w:rPr>
-        <w:t>cols</w:t>
-      </w:r>
-      <w:r>
-        <w:rPr>
-          <w:rFonts w:ascii="Consolas" w:hAnsi="Consolas"/>
-          <w:color w:val="BBBEBF"/>
-          <w:sz w:val="21"/>
-          <w:szCs w:val="21"/>
-          <w:lang w:val="uk-UA" w:eastAsia="uk-UA"/>
-        </w:rPr>
-        <w:t xml:space="preserve"> </w:t>
-      </w:r>
-      <w:r>
-        <w:rPr>
-          <w:rFonts w:ascii="Consolas" w:hAnsi="Consolas"/>
-          <w:color w:val="D4D4D4"/>
-          <w:sz w:val="21"/>
-          <w:szCs w:val="21"/>
-          <w:lang w:val="uk-UA" w:eastAsia="uk-UA"/>
-        </w:rPr>
-        <w:t>*</w:t>
-      </w:r>
-      <w:r>
-        <w:rPr>
-          <w:rFonts w:ascii="Consolas" w:hAnsi="Consolas"/>
-          <w:color w:val="BBBEBF"/>
-          <w:sz w:val="21"/>
-          <w:szCs w:val="21"/>
-          <w:lang w:val="uk-UA" w:eastAsia="uk-UA"/>
-        </w:rPr>
-        <w:t xml:space="preserve"> </w:t>
-      </w:r>
-      <w:r>
-        <w:rPr>
-          <w:rFonts w:ascii="Consolas" w:hAnsi="Consolas"/>
-          <w:color w:val="FFA657"/>
-          <w:sz w:val="21"/>
-          <w:szCs w:val="21"/>
-          <w:lang w:val="uk-UA" w:eastAsia="uk-UA"/>
-        </w:rPr>
-        <w:t>rows</w:t>
-      </w:r>
-      <w:r>
-        <w:rPr>
-          <w:rFonts w:ascii="Consolas" w:hAnsi="Consolas"/>
-          <w:color w:val="BBBEBF"/>
-          <w:sz w:val="21"/>
-          <w:szCs w:val="21"/>
-          <w:lang w:val="uk-UA" w:eastAsia="uk-UA"/>
-        </w:rPr>
-        <w:t xml:space="preserve">)) </w:t>
-      </w:r>
-      <w:r>
-        <w:rPr>
-          <w:rFonts w:ascii="Consolas" w:hAnsi="Consolas"/>
-          <w:color w:val="D2A8FF"/>
-          <w:sz w:val="21"/>
-          <w:szCs w:val="21"/>
-          <w:lang w:val="uk-UA" w:eastAsia="uk-UA"/>
-        </w:rPr>
-        <w:t>&lt;&lt;</w:t>
-      </w:r>
-      <w:r>
-        <w:rPr>
-          <w:rFonts w:ascii="Consolas" w:hAnsi="Consolas"/>
-          <w:color w:val="BBBEBF"/>
-          <w:sz w:val="21"/>
-          <w:szCs w:val="21"/>
-          <w:lang w:val="uk-UA" w:eastAsia="uk-UA"/>
-        </w:rPr>
-        <w:t xml:space="preserve"> </w:t>
-      </w:r>
-      <w:r>
-        <w:rPr>
-          <w:rFonts w:ascii="Consolas" w:hAnsi="Consolas"/>
-          <w:color w:val="D2A8FF"/>
-          <w:sz w:val="21"/>
-          <w:szCs w:val="21"/>
-          <w:lang w:val="uk-UA" w:eastAsia="uk-UA"/>
-        </w:rPr>
-        <w:t>endl</w:t>
-      </w:r>
-      <w:r>
-        <w:rPr>
-          <w:rFonts w:ascii="Consolas" w:hAnsi="Consolas"/>
-          <w:color w:val="BBBEBF"/>
-          <w:sz w:val="21"/>
-          <w:szCs w:val="21"/>
-          <w:lang w:val="uk-UA" w:eastAsia="uk-UA"/>
-        </w:rPr>
-        <w:t>;</w:t>
-      </w:r>
     </w:p>
     <w:p>
       <w:pPr>
@@ -33010,6 +32785,349 @@
           <w:szCs w:val="21"/>
           <w:lang w:val="uk-UA" w:eastAsia="uk-UA"/>
         </w:rPr>
+        <w:t>"Середня яскравість: "</w:t>
+      </w:r>
+      <w:r>
+        <w:rPr>
+          <w:rFonts w:ascii="Consolas" w:hAnsi="Consolas"/>
+          <w:color w:val="BBBEBF"/>
+          <w:sz w:val="21"/>
+          <w:szCs w:val="21"/>
+          <w:lang w:val="uk-UA" w:eastAsia="uk-UA"/>
+        </w:rPr>
+        <w:t xml:space="preserve"> </w:t>
+      </w:r>
+      <w:r>
+        <w:rPr>
+          <w:rFonts w:ascii="Consolas" w:hAnsi="Consolas"/>
+          <w:color w:val="D2A8FF"/>
+          <w:sz w:val="21"/>
+          <w:szCs w:val="21"/>
+          <w:lang w:val="uk-UA" w:eastAsia="uk-UA"/>
+        </w:rPr>
+        <w:t>&lt;&lt;</w:t>
+      </w:r>
+      <w:r>
+        <w:rPr>
+          <w:rFonts w:ascii="Consolas" w:hAnsi="Consolas"/>
+          <w:color w:val="BBBEBF"/>
+          <w:sz w:val="21"/>
+          <w:szCs w:val="21"/>
+          <w:lang w:val="uk-UA" w:eastAsia="uk-UA"/>
+        </w:rPr>
+        <w:t xml:space="preserve"> </w:t>
+      </w:r>
+      <w:r>
+        <w:rPr>
+          <w:rFonts w:ascii="Consolas" w:hAnsi="Consolas"/>
+          <w:color w:val="D2A8FF"/>
+          <w:sz w:val="21"/>
+          <w:szCs w:val="21"/>
+          <w:lang w:val="uk-UA" w:eastAsia="uk-UA"/>
+        </w:rPr>
+        <w:t>fixed</w:t>
+      </w:r>
+      <w:r>
+        <w:rPr>
+          <w:rFonts w:ascii="Consolas" w:hAnsi="Consolas"/>
+          <w:color w:val="BBBEBF"/>
+          <w:sz w:val="21"/>
+          <w:szCs w:val="21"/>
+          <w:lang w:val="uk-UA" w:eastAsia="uk-UA"/>
+        </w:rPr>
+        <w:t xml:space="preserve"> </w:t>
+      </w:r>
+      <w:r>
+        <w:rPr>
+          <w:rFonts w:ascii="Consolas" w:hAnsi="Consolas"/>
+          <w:color w:val="D2A8FF"/>
+          <w:sz w:val="21"/>
+          <w:szCs w:val="21"/>
+          <w:lang w:val="uk-UA" w:eastAsia="uk-UA"/>
+        </w:rPr>
+        <w:t>&lt;&lt;</w:t>
+      </w:r>
+      <w:r>
+        <w:rPr>
+          <w:rFonts w:ascii="Consolas" w:hAnsi="Consolas"/>
+          <w:color w:val="BBBEBF"/>
+          <w:sz w:val="21"/>
+          <w:szCs w:val="21"/>
+          <w:lang w:val="uk-UA" w:eastAsia="uk-UA"/>
+        </w:rPr>
+        <w:t xml:space="preserve"> </w:t>
+      </w:r>
+      <w:r>
+        <w:rPr>
+          <w:rFonts w:ascii="Consolas" w:hAnsi="Consolas"/>
+          <w:color w:val="D2A8FF"/>
+          <w:sz w:val="21"/>
+          <w:szCs w:val="21"/>
+          <w:lang w:val="uk-UA" w:eastAsia="uk-UA"/>
+        </w:rPr>
+        <w:t>setprecision</w:t>
+      </w:r>
+      <w:r>
+        <w:rPr>
+          <w:rFonts w:ascii="Consolas" w:hAnsi="Consolas"/>
+          <w:color w:val="BBBEBF"/>
+          <w:sz w:val="21"/>
+          <w:szCs w:val="21"/>
+          <w:lang w:val="uk-UA" w:eastAsia="uk-UA"/>
+        </w:rPr>
+        <w:t>(</w:t>
+      </w:r>
+      <w:r>
+        <w:rPr>
+          <w:rFonts w:ascii="Consolas" w:hAnsi="Consolas"/>
+          <w:color w:val="B5CEA8"/>
+          <w:sz w:val="21"/>
+          <w:szCs w:val="21"/>
+          <w:lang w:val="uk-UA" w:eastAsia="uk-UA"/>
+        </w:rPr>
+        <w:t>2</w:t>
+      </w:r>
+      <w:r>
+        <w:rPr>
+          <w:rFonts w:ascii="Consolas" w:hAnsi="Consolas"/>
+          <w:color w:val="BBBEBF"/>
+          <w:sz w:val="21"/>
+          <w:szCs w:val="21"/>
+          <w:lang w:val="uk-UA" w:eastAsia="uk-UA"/>
+        </w:rPr>
+        <w:t xml:space="preserve">) </w:t>
+      </w:r>
+      <w:r>
+        <w:rPr>
+          <w:rFonts w:ascii="Consolas" w:hAnsi="Consolas"/>
+          <w:color w:val="D2A8FF"/>
+          <w:sz w:val="21"/>
+          <w:szCs w:val="21"/>
+          <w:lang w:val="uk-UA" w:eastAsia="uk-UA"/>
+        </w:rPr>
+        <w:t>&lt;&lt;</w:t>
+      </w:r>
+      <w:r>
+        <w:rPr>
+          <w:rFonts w:ascii="Consolas" w:hAnsi="Consolas"/>
+          <w:color w:val="BBBEBF"/>
+          <w:sz w:val="21"/>
+          <w:szCs w:val="21"/>
+          <w:lang w:val="uk-UA" w:eastAsia="uk-UA"/>
+        </w:rPr>
+        <w:t xml:space="preserve"> (</w:t>
+      </w:r>
+      <w:r>
+        <w:rPr>
+          <w:rFonts w:ascii="Consolas" w:hAnsi="Consolas"/>
+          <w:color w:val="C9D1D9"/>
+          <w:sz w:val="21"/>
+          <w:szCs w:val="21"/>
+          <w:lang w:val="uk-UA" w:eastAsia="uk-UA"/>
+        </w:rPr>
+        <w:t>average_brightness</w:t>
+      </w:r>
+      <w:r>
+        <w:rPr>
+          <w:rFonts w:ascii="Consolas" w:hAnsi="Consolas"/>
+          <w:color w:val="BBBEBF"/>
+          <w:sz w:val="21"/>
+          <w:szCs w:val="21"/>
+          <w:lang w:val="uk-UA" w:eastAsia="uk-UA"/>
+        </w:rPr>
+        <w:t xml:space="preserve"> </w:t>
+      </w:r>
+      <w:r>
+        <w:rPr>
+          <w:rFonts w:ascii="Consolas" w:hAnsi="Consolas"/>
+          <w:color w:val="D4D4D4"/>
+          <w:sz w:val="21"/>
+          <w:szCs w:val="21"/>
+          <w:lang w:val="uk-UA" w:eastAsia="uk-UA"/>
+        </w:rPr>
+        <w:t>/</w:t>
+      </w:r>
+      <w:r>
+        <w:rPr>
+          <w:rFonts w:ascii="Consolas" w:hAnsi="Consolas"/>
+          <w:color w:val="BBBEBF"/>
+          <w:sz w:val="21"/>
+          <w:szCs w:val="21"/>
+          <w:lang w:val="uk-UA" w:eastAsia="uk-UA"/>
+        </w:rPr>
+        <w:t xml:space="preserve"> (</w:t>
+      </w:r>
+      <w:r>
+        <w:rPr>
+          <w:rFonts w:ascii="Consolas" w:hAnsi="Consolas"/>
+          <w:color w:val="FFA657"/>
+          <w:sz w:val="21"/>
+          <w:szCs w:val="21"/>
+          <w:lang w:val="uk-UA" w:eastAsia="uk-UA"/>
+        </w:rPr>
+        <w:t>cols</w:t>
+      </w:r>
+      <w:r>
+        <w:rPr>
+          <w:rFonts w:ascii="Consolas" w:hAnsi="Consolas"/>
+          <w:color w:val="BBBEBF"/>
+          <w:sz w:val="21"/>
+          <w:szCs w:val="21"/>
+          <w:lang w:val="uk-UA" w:eastAsia="uk-UA"/>
+        </w:rPr>
+        <w:t xml:space="preserve"> </w:t>
+      </w:r>
+      <w:r>
+        <w:rPr>
+          <w:rFonts w:ascii="Consolas" w:hAnsi="Consolas"/>
+          <w:color w:val="D4D4D4"/>
+          <w:sz w:val="21"/>
+          <w:szCs w:val="21"/>
+          <w:lang w:val="uk-UA" w:eastAsia="uk-UA"/>
+        </w:rPr>
+        <w:t>*</w:t>
+      </w:r>
+      <w:r>
+        <w:rPr>
+          <w:rFonts w:ascii="Consolas" w:hAnsi="Consolas"/>
+          <w:color w:val="BBBEBF"/>
+          <w:sz w:val="21"/>
+          <w:szCs w:val="21"/>
+          <w:lang w:val="uk-UA" w:eastAsia="uk-UA"/>
+        </w:rPr>
+        <w:t xml:space="preserve"> </w:t>
+      </w:r>
+      <w:r>
+        <w:rPr>
+          <w:rFonts w:ascii="Consolas" w:hAnsi="Consolas"/>
+          <w:color w:val="FFA657"/>
+          <w:sz w:val="21"/>
+          <w:szCs w:val="21"/>
+          <w:lang w:val="uk-UA" w:eastAsia="uk-UA"/>
+        </w:rPr>
+        <w:t>rows</w:t>
+      </w:r>
+      <w:r>
+        <w:rPr>
+          <w:rFonts w:ascii="Consolas" w:hAnsi="Consolas"/>
+          <w:color w:val="BBBEBF"/>
+          <w:sz w:val="21"/>
+          <w:szCs w:val="21"/>
+          <w:lang w:val="uk-UA" w:eastAsia="uk-UA"/>
+        </w:rPr>
+        <w:t xml:space="preserve">)) </w:t>
+      </w:r>
+      <w:r>
+        <w:rPr>
+          <w:rFonts w:ascii="Consolas" w:hAnsi="Consolas"/>
+          <w:color w:val="D2A8FF"/>
+          <w:sz w:val="21"/>
+          <w:szCs w:val="21"/>
+          <w:lang w:val="uk-UA" w:eastAsia="uk-UA"/>
+        </w:rPr>
+        <w:t>&lt;&lt;</w:t>
+      </w:r>
+      <w:r>
+        <w:rPr>
+          <w:rFonts w:ascii="Consolas" w:hAnsi="Consolas"/>
+          <w:color w:val="BBBEBF"/>
+          <w:sz w:val="21"/>
+          <w:szCs w:val="21"/>
+          <w:lang w:val="uk-UA" w:eastAsia="uk-UA"/>
+        </w:rPr>
+        <w:t xml:space="preserve"> </w:t>
+      </w:r>
+      <w:r>
+        <w:rPr>
+          <w:rFonts w:ascii="Consolas" w:hAnsi="Consolas"/>
+          <w:color w:val="D2A8FF"/>
+          <w:sz w:val="21"/>
+          <w:szCs w:val="21"/>
+          <w:lang w:val="uk-UA" w:eastAsia="uk-UA"/>
+        </w:rPr>
+        <w:t>endl</w:t>
+      </w:r>
+      <w:r>
+        <w:rPr>
+          <w:rFonts w:ascii="Consolas" w:hAnsi="Consolas"/>
+          <w:color w:val="BBBEBF"/>
+          <w:sz w:val="21"/>
+          <w:szCs w:val="21"/>
+          <w:lang w:val="uk-UA" w:eastAsia="uk-UA"/>
+        </w:rPr>
+        <w:t>;</w:t>
+      </w:r>
+    </w:p>
+    <w:p>
+      <w:pPr>
+        <w:shd w:val="clear" w:color="auto" w:fill="121314"/>
+        <w:spacing w:line="285" w:lineRule="atLeast"/>
+        <w:rPr>
+          <w:rFonts w:ascii="Consolas" w:hAnsi="Consolas"/>
+          <w:color w:val="BBBEBF"/>
+          <w:sz w:val="21"/>
+          <w:szCs w:val="21"/>
+          <w:lang w:val="uk-UA" w:eastAsia="uk-UA"/>
+        </w:rPr>
+      </w:pPr>
+      <w:r>
+        <w:rPr>
+          <w:rFonts w:ascii="Consolas" w:hAnsi="Consolas"/>
+          <w:color w:val="BBBEBF"/>
+          <w:sz w:val="21"/>
+          <w:szCs w:val="21"/>
+          <w:lang w:val="uk-UA" w:eastAsia="uk-UA"/>
+        </w:rPr>
+        <w:t xml:space="preserve">    </w:t>
+      </w:r>
+      <w:r>
+        <w:rPr>
+          <w:rFonts w:ascii="Consolas" w:hAnsi="Consolas"/>
+          <w:color w:val="C9D1D9"/>
+          <w:sz w:val="21"/>
+          <w:szCs w:val="21"/>
+          <w:lang w:val="uk-UA" w:eastAsia="uk-UA"/>
+        </w:rPr>
+        <w:t>cout</w:t>
+      </w:r>
+      <w:r>
+        <w:rPr>
+          <w:rFonts w:ascii="Consolas" w:hAnsi="Consolas"/>
+          <w:color w:val="BBBEBF"/>
+          <w:sz w:val="21"/>
+          <w:szCs w:val="21"/>
+          <w:lang w:val="uk-UA" w:eastAsia="uk-UA"/>
+        </w:rPr>
+        <w:t xml:space="preserve"> </w:t>
+      </w:r>
+      <w:r>
+        <w:rPr>
+          <w:rFonts w:ascii="Consolas" w:hAnsi="Consolas"/>
+          <w:color w:val="D2A8FF"/>
+          <w:sz w:val="21"/>
+          <w:szCs w:val="21"/>
+          <w:lang w:val="uk-UA" w:eastAsia="uk-UA"/>
+        </w:rPr>
+        <w:t>&lt;&lt;</w:t>
+      </w:r>
+      <w:r>
+        <w:rPr>
+          <w:rFonts w:ascii="Consolas" w:hAnsi="Consolas"/>
+          <w:color w:val="BBBEBF"/>
+          <w:sz w:val="21"/>
+          <w:szCs w:val="21"/>
+          <w:lang w:val="uk-UA" w:eastAsia="uk-UA"/>
+        </w:rPr>
+        <w:t xml:space="preserve"> </w:t>
+      </w:r>
+      <w:r>
+        <w:rPr>
+          <w:rFonts w:ascii="Consolas" w:hAnsi="Consolas"/>
+          <w:color w:val="A5D6FF"/>
+          <w:sz w:val="21"/>
+          <w:szCs w:val="21"/>
+          <w:lang w:val="uk-UA" w:eastAsia="uk-UA"/>
+        </w:rPr>
         <w:t>"Найтемніший піксель: "</w:t>
       </w:r>
       <w:r>
@@ -38486,29 +38604,28 @@
         </w:rPr>
         <w:t>        {</w:t>
       </w:r>
-      <w:bookmarkStart w:id="1" w:name="_GoBack"/>
-      <w:bookmarkEnd w:id="1"/>
-    </w:p>
-    <w:p>
-      <w:pPr>
-        <w:shd w:val="clear" w:color="auto" w:fill="121314"/>
-        <w:spacing w:line="285" w:lineRule="atLeast"/>
-        <w:rPr>
-          <w:rFonts w:ascii="Consolas" w:hAnsi="Consolas"/>
-          <w:color w:val="BBBEBF"/>
-          <w:sz w:val="21"/>
-          <w:szCs w:val="21"/>
-          <w:lang w:val="uk-UA" w:eastAsia="uk-UA"/>
-        </w:rPr>
-      </w:pPr>
-      <w:r>
-        <w:rPr>
-          <w:rFonts w:ascii="Consolas" w:hAnsi="Consolas"/>
-          <w:color w:val="C9D1D9"/>
-          <w:sz w:val="21"/>
-          <w:szCs w:val="21"/>
-          <w:lang w:val="uk-UA" w:eastAsia="uk-UA"/>
-        </w:rPr>
+    </w:p>
+    <w:p>
+      <w:pPr>
+        <w:shd w:val="clear" w:color="auto" w:fill="121314"/>
+        <w:spacing w:line="285" w:lineRule="atLeast"/>
+        <w:rPr>
+          <w:rFonts w:ascii="Consolas" w:hAnsi="Consolas"/>
+          <w:color w:val="BBBEBF"/>
+          <w:sz w:val="21"/>
+          <w:szCs w:val="21"/>
+          <w:lang w:val="uk-UA" w:eastAsia="uk-UA"/>
+        </w:rPr>
+      </w:pPr>
+      <w:r>
+        <w:rPr>
+          <w:rFonts w:ascii="Consolas" w:hAnsi="Consolas"/>
+          <w:color w:val="C9D1D9"/>
+          <w:sz w:val="21"/>
+          <w:szCs w:val="21"/>
+          <w:lang w:val="uk-UA" w:eastAsia="uk-UA"/>
+        </w:rPr>
+        <w:lastRenderedPageBreak/>
         <w:t>            rotated_array[j][</w:t>
       </w:r>
       <w:r>
@@ -38675,7 +38792,6 @@
           <w:szCs w:val="21"/>
           <w:lang w:val="uk-UA" w:eastAsia="uk-UA"/>
         </w:rPr>
-        <w:lastRenderedPageBreak/>
         <w:t>    }</w:t>
       </w:r>
     </w:p>
@@ -38954,7 +39070,7 @@
         <w:spacing w:line="285" w:lineRule="atLeast"/>
         <w:rPr>
           <w:rFonts w:ascii="Consolas" w:hAnsi="Consolas"/>
-          <w:color w:val="BBBEBF"/>
+          <w:color w:val="C9D1D9"/>
           <w:sz w:val="21"/>
           <w:szCs w:val="21"/>
           <w:lang w:val="uk-UA" w:eastAsia="uk-UA"/>
@@ -39010,6 +39126,124 @@
         </w:rPr>
         <w:t>[i];</w:t>
       </w:r>
+    </w:p>
+    <w:p>
+      <w:pPr>
+        <w:shd w:val="clear" w:color="auto" w:fill="121314"/>
+        <w:spacing w:line="285" w:lineRule="atLeast"/>
+        <w:rPr>
+          <w:rFonts w:ascii="Consolas" w:hAnsi="Consolas"/>
+          <w:color w:val="BBBEBF"/>
+          <w:sz w:val="21"/>
+          <w:szCs w:val="21"/>
+          <w:lang w:val="uk-UA" w:eastAsia="uk-UA"/>
+        </w:rPr>
+      </w:pPr>
+      <w:r>
+        <w:rPr>
+          <w:rFonts w:ascii="Consolas" w:hAnsi="Consolas"/>
+          <w:color w:val="C9D1D9"/>
+          <w:sz w:val="21"/>
+          <w:szCs w:val="21"/>
+          <w:lang w:val="en-US" w:eastAsia="uk-UA"/>
+        </w:rPr>
+        <w:t xml:space="preserve">        </w:t>
+      </w:r>
+      <w:proofErr w:type="gramStart"/>
+      <w:r>
+        <w:rPr>
+          <w:rFonts w:ascii="Consolas" w:hAnsi="Consolas"/>
+          <w:color w:val="C9D1D9"/>
+          <w:sz w:val="21"/>
+          <w:szCs w:val="21"/>
+          <w:lang w:val="en-US" w:eastAsia="uk-UA"/>
+        </w:rPr>
+        <w:t>i</w:t>
+      </w:r>
+      <w:r>
+        <w:rPr>
+          <w:rFonts w:ascii="Consolas" w:hAnsi="Consolas"/>
+          <w:color w:val="C9D1D9"/>
+          <w:sz w:val="21"/>
+          <w:szCs w:val="21"/>
+          <w:lang w:val="uk-UA" w:eastAsia="uk-UA"/>
+        </w:rPr>
+        <w:t>mg</w:t>
+      </w:r>
+      <w:r>
+        <w:rPr>
+          <w:rFonts w:ascii="Consolas" w:hAnsi="Consolas"/>
+          <w:color w:val="C9D1D9"/>
+          <w:sz w:val="21"/>
+          <w:szCs w:val="21"/>
+          <w:lang w:val="uk-UA" w:eastAsia="uk-UA"/>
+        </w:rPr>
+        <w:t>[</w:t>
+      </w:r>
+      <w:proofErr w:type="gramEnd"/>
+      <w:r>
+        <w:rPr>
+          <w:rFonts w:ascii="Consolas" w:hAnsi="Consolas"/>
+          <w:color w:val="C9D1D9"/>
+          <w:sz w:val="21"/>
+          <w:szCs w:val="21"/>
+          <w:lang w:val="uk-UA" w:eastAsia="uk-UA"/>
+        </w:rPr>
+        <w:t xml:space="preserve">i] </w:t>
+      </w:r>
+      <w:r>
+        <w:rPr>
+          <w:rFonts w:ascii="Consolas" w:hAnsi="Consolas"/>
+          <w:color w:val="D4D4D4"/>
+          <w:sz w:val="21"/>
+          <w:szCs w:val="21"/>
+          <w:lang w:val="uk-UA" w:eastAsia="uk-UA"/>
+        </w:rPr>
+        <w:t>=</w:t>
+      </w:r>
+      <w:r>
+        <w:rPr>
+          <w:rFonts w:ascii="Consolas" w:hAnsi="Consolas"/>
+          <w:color w:val="C9D1D9"/>
+          <w:sz w:val="21"/>
+          <w:szCs w:val="21"/>
+          <w:lang w:val="uk-UA" w:eastAsia="uk-UA"/>
+        </w:rPr>
+        <w:t xml:space="preserve"> </w:t>
+      </w:r>
+      <w:r>
+        <w:rPr>
+          <w:rFonts w:ascii="Consolas" w:hAnsi="Consolas"/>
+          <w:color w:val="569CD6"/>
+          <w:sz w:val="21"/>
+          <w:szCs w:val="21"/>
+          <w:lang w:val="uk-UA" w:eastAsia="uk-UA"/>
+        </w:rPr>
+        <w:t>nullptr</w:t>
+      </w:r>
+      <w:r>
+        <w:rPr>
+          <w:rFonts w:ascii="Consolas" w:hAnsi="Consolas"/>
+          <w:color w:val="C9D1D9"/>
+          <w:sz w:val="21"/>
+          <w:szCs w:val="21"/>
+          <w:lang w:val="uk-UA" w:eastAsia="uk-UA"/>
+        </w:rPr>
+        <w:t>;</w:t>
+      </w:r>
+    </w:p>
+    <w:p>
+      <w:pPr>
+        <w:shd w:val="clear" w:color="auto" w:fill="121314"/>
+        <w:spacing w:line="285" w:lineRule="atLeast"/>
+        <w:rPr>
+          <w:rFonts w:ascii="Consolas" w:hAnsi="Consolas"/>
+          <w:color w:val="BBBEBF"/>
+          <w:sz w:val="21"/>
+          <w:szCs w:val="21"/>
+          <w:lang w:val="uk-UA" w:eastAsia="uk-UA"/>
+        </w:rPr>
+      </w:pPr>
     </w:p>
     <w:p>
       <w:pPr>
@@ -40073,6 +40307,7 @@
           <w:sz w:val="21"/>
           <w:szCs w:val="21"/>
         </w:rPr>
+        <w:lastRenderedPageBreak/>
         <w:t>#include</w:t>
       </w:r>
       <w:r>
@@ -40265,7 +40500,6 @@
           <w:sz w:val="21"/>
           <w:szCs w:val="21"/>
         </w:rPr>
-        <w:lastRenderedPageBreak/>
         <w:t>{</w:t>
       </w:r>
     </w:p>
@@ -42852,6 +43086,7 @@
           <w:sz w:val="21"/>
           <w:szCs w:val="21"/>
         </w:rPr>
+        <w:lastRenderedPageBreak/>
         <w:t xml:space="preserve">Далі йдуть </w:t>
       </w:r>
       <w:r>
@@ -43008,7 +43243,6 @@
           <w:sz w:val="21"/>
           <w:szCs w:val="21"/>
         </w:rPr>
-        <w:lastRenderedPageBreak/>
         <w:t xml:space="preserve">У наступних </w:t>
       </w:r>
       <w:r>
@@ -45150,6 +45384,7 @@
           <w:sz w:val="28"/>
           <w:lang w:val="uk-UA"/>
         </w:rPr>
+        <w:lastRenderedPageBreak/>
         <w:t>4</w:t>
       </w:r>
       <w:r>
@@ -45212,7 +45447,6 @@
           <w:color w:val="000000"/>
           <w:lang w:val="uk-UA" w:eastAsia="uk-UA"/>
         </w:rPr>
-        <w:lastRenderedPageBreak/>
         <w:drawing>
           <wp:inline distT="0" distB="0" distL="0" distR="0" wp14:anchorId="0B08DDC5" wp14:editId="4D502BCB">
             <wp:extent cx="2796782" cy="952583"/>
@@ -45981,6 +46215,7 @@
           <w:szCs w:val="18"/>
           <w:lang w:val="uk-UA"/>
         </w:rPr>
+        <w:lastRenderedPageBreak/>
         <w:tab/>
       </w:r>
       <w:r>
@@ -46092,7 +46327,6 @@
           <w:color w:val="000000"/>
           <w:lang w:val="uk-UA"/>
         </w:rPr>
-        <w:lastRenderedPageBreak/>
         <w:t>Затрачений час: 25хв</w:t>
       </w:r>
     </w:p>
@@ -46325,6 +46559,7 @@
           <w:sz w:val="18"/>
           <w:szCs w:val="18"/>
         </w:rPr>
+        <w:lastRenderedPageBreak/>
         <w:t xml:space="preserve">Рис </w:t>
       </w:r>
       <w:r>
@@ -46399,7 +46634,6 @@
           <w:color w:val="000000"/>
           <w:lang w:val="uk-UA"/>
         </w:rPr>
-        <w:lastRenderedPageBreak/>
         <w:t xml:space="preserve">Завдання 6. </w:t>
       </w:r>
       <w:r>
@@ -47070,6 +47304,7 @@
           <w:color w:val="000000"/>
           <w:lang w:val="uk-UA"/>
         </w:rPr>
+        <w:lastRenderedPageBreak/>
         <w:t>Висновок: Під час виконання Лабораторної роботи 4 я успішно опанував, концепції роботи із масивами, вказівниками , та динамічним виділенням пам’яті. Навчився створювати та занулювати динамічні масиви, розвинув свої вміння у створенні та роботі із двовимірними масивами.Засвоїв поняття адресної арифметики,алгоритми обробки.Дізнався про алгоритми обробки масивів.</w:t>
       </w:r>
     </w:p>

</xml_diff>